<commit_message>
Regenerate final deliverables with design system, seed data, and student info
</commit_message>
<xml_diff>
--- a/deliverables/reports/网上书店-技术报告.docx
+++ b/deliverables/reports/网上书店-技术报告.docx
@@ -113,6 +113,82 @@
                 <w:sz w:val="24"/>
               </w:rPr>
               <w:t>网上书店管理系统</w:t>
+            </w:r>
+          </w:p>
+        </w:tc>
+      </w:tr>
+      <w:tr>
+        <w:tc>
+          <w:tcPr>
+            <w:tcW w:type="dxa" w:w="4680"/>
+            <w:vAlign w:val="center"/>
+          </w:tcPr>
+          <w:p>
+            <w:pPr>
+              <w:spacing w:line="360" w:lineRule="auto" w:after="0"/>
+            </w:pPr>
+            <w:r>
+              <w:rPr>
+                <w:rFonts w:ascii="Times New Roman" w:hAnsi="Times New Roman" w:eastAsia="SimSun"/>
+                <w:sz w:val="24"/>
+              </w:rPr>
+              <w:t>学生姓名</w:t>
+            </w:r>
+          </w:p>
+        </w:tc>
+        <w:tc>
+          <w:tcPr>
+            <w:tcW w:type="dxa" w:w="4680"/>
+            <w:vAlign w:val="center"/>
+          </w:tcPr>
+          <w:p>
+            <w:pPr>
+              <w:spacing w:line="360" w:lineRule="auto" w:after="0"/>
+            </w:pPr>
+            <w:r>
+              <w:rPr>
+                <w:rFonts w:ascii="Times New Roman" w:hAnsi="Times New Roman" w:eastAsia="SimSun"/>
+                <w:sz w:val="24"/>
+              </w:rPr>
+              <w:t>Bagtyyar Kovusov</w:t>
+            </w:r>
+          </w:p>
+        </w:tc>
+      </w:tr>
+      <w:tr>
+        <w:tc>
+          <w:tcPr>
+            <w:tcW w:type="dxa" w:w="4680"/>
+            <w:vAlign w:val="center"/>
+          </w:tcPr>
+          <w:p>
+            <w:pPr>
+              <w:spacing w:line="360" w:lineRule="auto" w:after="0"/>
+            </w:pPr>
+            <w:r>
+              <w:rPr>
+                <w:rFonts w:ascii="Times New Roman" w:hAnsi="Times New Roman" w:eastAsia="SimSun"/>
+                <w:sz w:val="24"/>
+              </w:rPr>
+              <w:t>学号</w:t>
+            </w:r>
+          </w:p>
+        </w:tc>
+        <w:tc>
+          <w:tcPr>
+            <w:tcW w:type="dxa" w:w="4680"/>
+            <w:vAlign w:val="center"/>
+          </w:tcPr>
+          <w:p>
+            <w:pPr>
+              <w:spacing w:line="360" w:lineRule="auto" w:after="0"/>
+            </w:pPr>
+            <w:r>
+              <w:rPr>
+                <w:rFonts w:ascii="Times New Roman" w:hAnsi="Times New Roman" w:eastAsia="SimSun"/>
+                <w:sz w:val="24"/>
+              </w:rPr>
+              <w:t>312024805043</w:t>
             </w:r>
           </w:p>
         </w:tc>
@@ -4300,7 +4376,7 @@
       <w:r>
         <w:drawing>
           <wp:inline xmlns:a="http://schemas.openxmlformats.org/drawingml/2006/main" xmlns:pic="http://schemas.openxmlformats.org/drawingml/2006/picture">
-            <wp:extent cx="5669280" cy="3937000"/>
+            <wp:extent cx="5669280" cy="3352848"/>
             <wp:docPr id="1" name="Picture 1"/>
             <wp:cNvGraphicFramePr>
               <a:graphicFrameLocks noChangeAspect="1"/>
@@ -4321,7 +4397,7 @@
                   <pic:spPr>
                     <a:xfrm>
                       <a:off x="0" y="0"/>
-                      <a:ext cx="5669280" cy="3937000"/>
+                      <a:ext cx="5669280" cy="3352848"/>
                     </a:xfrm>
                     <a:prstGeom prst="rect"/>
                   </pic:spPr>
@@ -4378,7 +4454,7 @@
       <w:r>
         <w:drawing>
           <wp:inline xmlns:a="http://schemas.openxmlformats.org/drawingml/2006/main" xmlns:pic="http://schemas.openxmlformats.org/drawingml/2006/picture">
-            <wp:extent cx="5669280" cy="3937000"/>
+            <wp:extent cx="5669280" cy="3352848"/>
             <wp:docPr id="2" name="Picture 2"/>
             <wp:cNvGraphicFramePr>
               <a:graphicFrameLocks noChangeAspect="1"/>
@@ -4399,7 +4475,7 @@
                   <pic:spPr>
                     <a:xfrm>
                       <a:off x="0" y="0"/>
-                      <a:ext cx="5669280" cy="3937000"/>
+                      <a:ext cx="5669280" cy="3352848"/>
                     </a:xfrm>
                     <a:prstGeom prst="rect"/>
                   </pic:spPr>
@@ -4456,7 +4532,7 @@
       <w:r>
         <w:drawing>
           <wp:inline xmlns:a="http://schemas.openxmlformats.org/drawingml/2006/main" xmlns:pic="http://schemas.openxmlformats.org/drawingml/2006/picture">
-            <wp:extent cx="5669280" cy="3937000"/>
+            <wp:extent cx="5669280" cy="3352848"/>
             <wp:docPr id="3" name="Picture 3"/>
             <wp:cNvGraphicFramePr>
               <a:graphicFrameLocks noChangeAspect="1"/>
@@ -4477,7 +4553,7 @@
                   <pic:spPr>
                     <a:xfrm>
                       <a:off x="0" y="0"/>
-                      <a:ext cx="5669280" cy="3937000"/>
+                      <a:ext cx="5669280" cy="3352848"/>
                     </a:xfrm>
                     <a:prstGeom prst="rect"/>
                   </pic:spPr>
@@ -4534,7 +4610,7 @@
       <w:r>
         <w:drawing>
           <wp:inline xmlns:a="http://schemas.openxmlformats.org/drawingml/2006/main" xmlns:pic="http://schemas.openxmlformats.org/drawingml/2006/picture">
-            <wp:extent cx="5669280" cy="3937000"/>
+            <wp:extent cx="5669280" cy="3352848"/>
             <wp:docPr id="4" name="Picture 4"/>
             <wp:cNvGraphicFramePr>
               <a:graphicFrameLocks noChangeAspect="1"/>
@@ -4555,7 +4631,7 @@
                   <pic:spPr>
                     <a:xfrm>
                       <a:off x="0" y="0"/>
-                      <a:ext cx="5669280" cy="3937000"/>
+                      <a:ext cx="5669280" cy="3352848"/>
                     </a:xfrm>
                     <a:prstGeom prst="rect"/>
                   </pic:spPr>
@@ -4612,7 +4688,7 @@
       <w:r>
         <w:drawing>
           <wp:inline xmlns:a="http://schemas.openxmlformats.org/drawingml/2006/main" xmlns:pic="http://schemas.openxmlformats.org/drawingml/2006/picture">
-            <wp:extent cx="5669280" cy="3937000"/>
+            <wp:extent cx="5669280" cy="3352848"/>
             <wp:docPr id="5" name="Picture 5"/>
             <wp:cNvGraphicFramePr>
               <a:graphicFrameLocks noChangeAspect="1"/>
@@ -4633,7 +4709,7 @@
                   <pic:spPr>
                     <a:xfrm>
                       <a:off x="0" y="0"/>
-                      <a:ext cx="5669280" cy="3937000"/>
+                      <a:ext cx="5669280" cy="3352848"/>
                     </a:xfrm>
                     <a:prstGeom prst="rect"/>
                   </pic:spPr>
@@ -4690,7 +4766,7 @@
       <w:r>
         <w:drawing>
           <wp:inline xmlns:a="http://schemas.openxmlformats.org/drawingml/2006/main" xmlns:pic="http://schemas.openxmlformats.org/drawingml/2006/picture">
-            <wp:extent cx="5669280" cy="3937000"/>
+            <wp:extent cx="5669280" cy="3352848"/>
             <wp:docPr id="6" name="Picture 6"/>
             <wp:cNvGraphicFramePr>
               <a:graphicFrameLocks noChangeAspect="1"/>
@@ -4711,7 +4787,7 @@
                   <pic:spPr>
                     <a:xfrm>
                       <a:off x="0" y="0"/>
-                      <a:ext cx="5669280" cy="3937000"/>
+                      <a:ext cx="5669280" cy="3352848"/>
                     </a:xfrm>
                     <a:prstGeom prst="rect"/>
                   </pic:spPr>
@@ -4768,7 +4844,7 @@
       <w:r>
         <w:drawing>
           <wp:inline xmlns:a="http://schemas.openxmlformats.org/drawingml/2006/main" xmlns:pic="http://schemas.openxmlformats.org/drawingml/2006/picture">
-            <wp:extent cx="5669280" cy="4859383"/>
+            <wp:extent cx="5669280" cy="3352848"/>
             <wp:docPr id="7" name="Picture 7"/>
             <wp:cNvGraphicFramePr>
               <a:graphicFrameLocks noChangeAspect="1"/>
@@ -4789,7 +4865,7 @@
                   <pic:spPr>
                     <a:xfrm>
                       <a:off x="0" y="0"/>
-                      <a:ext cx="5669280" cy="4859383"/>
+                      <a:ext cx="5669280" cy="3352848"/>
                     </a:xfrm>
                     <a:prstGeom prst="rect"/>
                   </pic:spPr>
@@ -4846,7 +4922,7 @@
       <w:r>
         <w:drawing>
           <wp:inline xmlns:a="http://schemas.openxmlformats.org/drawingml/2006/main" xmlns:pic="http://schemas.openxmlformats.org/drawingml/2006/picture">
-            <wp:extent cx="5669280" cy="3937000"/>
+            <wp:extent cx="5669280" cy="3352848"/>
             <wp:docPr id="8" name="Picture 8"/>
             <wp:cNvGraphicFramePr>
               <a:graphicFrameLocks noChangeAspect="1"/>
@@ -4867,7 +4943,7 @@
                   <pic:spPr>
                     <a:xfrm>
                       <a:off x="0" y="0"/>
-                      <a:ext cx="5669280" cy="3937000"/>
+                      <a:ext cx="5669280" cy="3352848"/>
                     </a:xfrm>
                     <a:prstGeom prst="rect"/>
                   </pic:spPr>
@@ -4924,7 +5000,7 @@
       <w:r>
         <w:drawing>
           <wp:inline xmlns:a="http://schemas.openxmlformats.org/drawingml/2006/main" xmlns:pic="http://schemas.openxmlformats.org/drawingml/2006/picture">
-            <wp:extent cx="5669280" cy="3937000"/>
+            <wp:extent cx="5669280" cy="3352848"/>
             <wp:docPr id="9" name="Picture 9"/>
             <wp:cNvGraphicFramePr>
               <a:graphicFrameLocks noChangeAspect="1"/>
@@ -4945,7 +5021,7 @@
                   <pic:spPr>
                     <a:xfrm>
                       <a:off x="0" y="0"/>
-                      <a:ext cx="5669280" cy="3937000"/>
+                      <a:ext cx="5669280" cy="3352848"/>
                     </a:xfrm>
                     <a:prstGeom prst="rect"/>
                   </pic:spPr>
@@ -5002,7 +5078,7 @@
       <w:r>
         <w:drawing>
           <wp:inline xmlns:a="http://schemas.openxmlformats.org/drawingml/2006/main" xmlns:pic="http://schemas.openxmlformats.org/drawingml/2006/picture">
-            <wp:extent cx="5669280" cy="3937000"/>
+            <wp:extent cx="5669280" cy="3352848"/>
             <wp:docPr id="10" name="Picture 10"/>
             <wp:cNvGraphicFramePr>
               <a:graphicFrameLocks noChangeAspect="1"/>
@@ -5023,7 +5099,7 @@
                   <pic:spPr>
                     <a:xfrm>
                       <a:off x="0" y="0"/>
-                      <a:ext cx="5669280" cy="3937000"/>
+                      <a:ext cx="5669280" cy="3352848"/>
                     </a:xfrm>
                     <a:prstGeom prst="rect"/>
                   </pic:spPr>
@@ -7168,7 +7244,7 @@
         <w:rFonts w:ascii="Times New Roman" w:hAnsi="Times New Roman" w:eastAsia="SimSun"/>
         <w:sz w:val="20"/>
       </w:rPr>
-      <w:t>网上书店管理系统课程设计</w:t>
+      <w:t>网上书店管理系统课程设计 · Bagtyyar Kovusov 312024805043</w:t>
     </w:r>
   </w:p>
 </w:ftr>

</xml_diff>